<commit_message>
S6.1 CF edit 1 (Mark): Step 2 gains search_record + field-bibliography sweep + saturation statement bullets (pure 3-para insertion after the Confidence-C flag bullet, verified prefix/suffix byte-equal); V7.4 promotion decision recorded
Co-Authored-By: Claude Fable 5 <noreply@anthropic.com>
</commit_message>
<xml_diff>
--- a/L3B-World-Build-Methodology/CiC_L3B_Formation_World_Construction_Framework_V7.4_DRAFT.docx
+++ b/L3B-World-Build-Methodology/CiC_L3B_Formation_World_Construction_Framework_V7.4_DRAFT.docx
@@ -6955,6 +6955,45 @@
       </w:pPr>
       <w:r>
         <w:t xml:space="preserve">Flag entries resting at Confidence C or below that are intended to support a vivid, specific claim, rather than tradition-level color, for priority independent second-opinion review</w:t>
+      </w:r>
+    </w:p>
+    <w:p>
+      <w:pPr>
+        <w:pStyle w:val="ListParagraph"/>
+        <w:numPr>
+          <w:ilvl w:val="0"/>
+          <w:numId w:val="2"/>
+        </w:numPr>
+        <w:spacing w:after="60"/>
+      </w:pPr>
+      <w:r>
+        <w:t xml:space="preserve">Keep a search_record as the discovery work proceeds: every discovery channel used (databases, field bibliographies, reference works, snowball chains), with instrument and date per search, logged as searches happen — never reconstructed afterward. Every source row carries its own discovery_channel, discovery_instrument, and discovery_date from this record.</w:t>
+      </w:r>
+    </w:p>
+    <w:p>
+      <w:pPr>
+        <w:pStyle w:val="ListParagraph"/>
+        <w:numPr>
+          <w:ilvl w:val="0"/>
+          <w:numId w:val="2"/>
+        </w:numPr>
+        <w:spacing w:after="60"/>
+      </w:pPr>
+      <w:r>
+        <w:t xml:space="preserve">Run a field-bibliography sweep before the Registry closes: check the world’s standard bibliographic instruments and reference works for load-bearing sources the ecology work has not yet surfaced, and disposition every find — rowed, or excluded with a reason. Name any instrument the sweep could not reach as a coverage limit.</w:t>
+      </w:r>
+    </w:p>
+    <w:p>
+      <w:pPr>
+        <w:pStyle w:val="ListParagraph"/>
+        <w:numPr>
+          <w:ilvl w:val="0"/>
+          <w:numId w:val="2"/>
+        </w:numPr>
+        <w:spacing w:after="60"/>
+      </w:pPr>
+      <w:r>
+        <w:t xml:space="preserve">Close the Registry with a saturation statement naming the last unproductive searches — which queries, against which instruments, returned nothing new. A Registry without a saturation statement is not complete: “we stopped finding new sources” is a claim, and it must name its evidence (Completion Standard V1.0, section A, source row).</w:t>
       </w:r>
     </w:p>
     <w:p>

</xml_diff>

<commit_message>
S6.1 CF edit 2 (Mark): Doc_02 review requirement - relative-recall test + PRESS question verbatim, answers recorded and dispositioned (pure 1-para insertion, verified)
Co-Authored-By: Claude Fable 5 <noreply@anthropic.com>
</commit_message>
<xml_diff>
--- a/L3B-World-Build-Methodology/CiC_L3B_Formation_World_Construction_Framework_V7.4_DRAFT.docx
+++ b/L3B-World-Build-Methodology/CiC_L3B_Formation_World_Construction_Framework_V7.4_DRAFT.docx
@@ -7023,6 +7023,14 @@
       </w:pPr>
       <w:r>
         <w:t xml:space="preserve">Forces Framework integration: Step 2. Forces lens applied to source ecology.</w:t>
+      </w:r>
+    </w:p>
+    <w:p>
+      <w:pPr>
+        <w:spacing w:after="180"/>
+      </w:pPr>
+      <w:r>
+        <w:t xml:space="preserve">Doc_02 review requirement: the review round includes the reviewer-side coverage checks — the ten-item relative-recall test (the reviewer names ten works a specialist would expect this world’s bibliography to contain, drawn from an instrument independent of the build; recall = found/10, logged) — and the PRESS question, asked verbatim: “Name up to three sources you would expect a bibliography of this world to contain that this registry does not hold. If you can name none, say so explicitly.” The answer is recorded in the review artifact, and every named work is dispositioned — rowed, or excluded with a reason.</w:t>
       </w:r>
     </w:p>
     <w:p>

</xml_diff>

<commit_message>
S6.1 CF edit 3 (Mark): Freeze Criteria split into world-freeze and representative-freeze with Completion Standard pointer (verified -3/+3 paragraph diff, all other members identical)
Co-Authored-By: Claude Fable 5 <noreply@anthropic.com>
</commit_message>
<xml_diff>
--- a/L3B-World-Build-Methodology/CiC_L3B_Formation_World_Construction_Framework_V7.4_DRAFT.docx
+++ b/L3B-World-Build-Methodology/CiC_L3B_Formation_World_Construction_Framework_V7.4_DRAFT.docx
@@ -6360,7 +6360,7 @@
         <w:spacing w:after="180"/>
       </w:pPr>
       <w:r>
-        <w:t xml:space="preserve">A world may be considered ready for freeze when:</w:t>
+        <w:t xml:space="preserve">World-freeze — a world’s record set may be considered ready for freeze when:</w:t>
       </w:r>
     </w:p>
     <w:p>
@@ -6438,32 +6438,6 @@
         <w:spacing w:after="60"/>
       </w:pPr>
       <w:r>
-        <w:t>representative voices are accountable and appropriately grounded (per CO-014)</w:t>
-      </w:r>
-    </w:p>
-    <w:p>
-      <w:pPr>
-        <w:pStyle w:val="ListParagraph"/>
-        <w:numPr>
-          <w:ilvl w:val="0"/>
-          <w:numId w:val="2"/>
-        </w:numPr>
-        <w:spacing w:after="60"/>
-      </w:pPr>
-      <w:r>
-        <w:t xml:space="preserve">encounter testing is successful</w:t>
-      </w:r>
-    </w:p>
-    <w:p>
-      <w:pPr>
-        <w:pStyle w:val="ListParagraph"/>
-        <w:numPr>
-          <w:ilvl w:val="0"/>
-          <w:numId w:val="2"/>
-        </w:numPr>
-        <w:spacing w:after="60"/>
-      </w:pPr>
-      <w:r>
         <w:t xml:space="preserve">ecological integrity testing is satisfactory</w:t>
       </w:r>
     </w:p>
@@ -6543,6 +6517,22 @@
       </w:pPr>
       <w:r>
         <w:t xml:space="preserve">Source Registry complete (every Doc_02 claim traceable to a Registry row; every Native entry has a Licensed-For target) and the deployed Permanent Prompt’s grounding-anchor paragraph verified to be drawn from it (Source Registry Template — freeze-eligibility gate, new in V7.4). A complete Registry without a verified grounding-anchor paragraph in the deployed prompt does not satisfy this gate — the Registry alone does not constrain generation.</w:t>
+      </w:r>
+    </w:p>
+    <w:p>
+      <w:pPr>
+        <w:spacing w:after="180"/>
+      </w:pPr>
+      <w:r>
+        <w:t xml:space="preserve">Representative-freeze — after world-freeze, the Representative may freeze when: representative voices are accountable and appropriately grounded (per CO-014), and encounter testing is successful — run as the governing Completion Standard V1.0 section C specifies: RCF Part Eight’s probe categories plus the parroting and pushback categories under the Validation Protocol Rigor discipline above, continuity regression against the prior version where one exists, and the Table Readiness Round passed, with findings routed (a) runtime, (b) records, or (c) framework change, and (b)/(c) closed or explicitly accepted before freeze.</w:t>
+      </w:r>
+    </w:p>
+    <w:p>
+      <w:pPr>
+        <w:spacing w:after="180"/>
+      </w:pPr>
+      <w:r>
+        <w:t xml:space="preserve">The authoritative requirements tables for both freezes live in the governing Completion Standard V1.0 (Ministry/Technology/CiC_World_Build_Completion_Standard_V1.0.md); this section names the split and defers the detail there.</w:t>
       </w:r>
     </w:p>
     <w:p>

</xml_diff>